<commit_message>
fable massacre removing redundant content and shortening
</commit_message>
<xml_diff>
--- a/dissertation.docx
+++ b/dissertation.docx
@@ -4028,7 +4028,7 @@
         <w:spacing w:after="160" w:line="360" w:lineRule="auto"/>
       </w:pPr>
       <w:r>
-        <w:t>Chapter 2 provides the necessary background and reviews related work: load balancing and the Layer 4 / Layer 7 distinction, the Linux mechanisms for distributing connections, the research systems that have tried to improve on them, eBPF, and the Hermes architecture itself, closing with where Micro-Hermes sits in that body of work. Chapter 3 specifies the requirements the software had to meet, distinguishing those inherited from the Hermes paper from those the author added. Chapter 4 describes the development process, and Chapter 5 records ethical considerations. Chapter 6 presents the design, which both versions share, and Chapter 7 the two implementations. Chapter 8 evaluates them, reporting each version's results and then comparing the two directly. Chapter 9 concludes with contributions, limitations, and remaining work. Appendices provide the testing summary, a user manual for building and reproducing every result, and the ethics self-assessment.</w:t>
+        <w:t>Chapter 2 provides the necessary background and reviews related work: load balancing and the Layer 4 / Layer 7 distinction, the Linux mechanisms for distributing connections, the research systems that have tried to improve on them, eBPF, and the Hermes architecture itself, closing with where Micro-Hermes sits in that body of work. Chapter 3 specifies the requirements the software had to meet, distinguishing those inherited from the Hermes paper from those the author added. Chapter 4 describes the development process, and Chapter 5 records ethical considerations. Chapter 6 presents the design, which both versions share, and Chapter 7 the two implementations. Chapter 8 evaluates them, reporting each version's results and then comparing the two directly. Chapter 9 concludes with contributions, limitations, and remaining work. An appendix provides the ethics self-assessment; the testing summary and the user manual for building and reproducing every result accompany the code in the repository (TESTING_SUMMARY.md and README.md).</w:t>
       </w:r>
     </w:p>
     <w:p>
@@ -4931,7 +4931,7 @@
         <w:spacing w:after="160" w:line="360" w:lineRule="auto"/>
       </w:pPr>
       <w:r>
-        <w:t>Testing was benchmark driven. The rankings the paper expects in each traffic regime were written down as explicit validation targets before the benchmarks were run, and the analysis pipeline checks them automatically (Section 8.1); because the targets were fixed in advance, one now fails for the eBPF version and is reported as failing (Appendix A) rather than retuned after the fact. The analysis notebook, benchmark scripts and results are all kept in the repository, so the evaluation can be reproduced from a clean checkout.</w:t>
+        <w:t>Testing was benchmark driven. The rankings the paper expects in each traffic regime were written down as explicit validation targets before the benchmarks were run, and the analysis pipeline checks them automatically (Section 8.1); because the targets were fixed in advance, one now fails for the eBPF version and is reported as failing (Section 8.1) rather than retuned after the fact. The analysis notebook, benchmark scripts and results are all kept in the repository, so the evaluation can be reproduced from a clean checkout.</w:t>
       </w:r>
     </w:p>
     <w:p>
@@ -5811,6 +5811,17 @@
     </w:p>
     <w:p>
       <w:pPr>
+        <w:spacing w:after="160"/>
+      </w:pPr>
+      <w:r>
+        <w:rPr>
+          <w:sz w:val="22"/>
+        </w:rPr>
+        <w:t>The paper's qualitative expectations were additionally written down as eight machine-checkable predicates before the benchmarks were run (for example: "Case 3: LIFO's open-connection SD exceeds three times either alternative's"), which the analysis notebook evaluates against every run. All eight hold for the simulation. For the eBPF version, seven hold and one fails: Micro-Hermes's Case 4 tail-latency advantage over reuseport is 1.40x where the predicate, calibrated in advance against the simulation's numbers, required 1.5x. The direction of the result is unchanged and the margin still widens with load; the threshold is reported as failing rather than quietly re-tuned.</w:t>
+      </w:r>
+    </w:p>
+    <w:p>
+      <w:pPr>
         <w:spacing w:after="160" w:line="360" w:lineRule="auto"/>
       </w:pPr>
       <w:r>
@@ -6946,529 +6957,16 @@
     <w:p>
       <w:pPr>
         <w:pStyle w:val="Heading1"/>
-        <w:spacing w:before="360" w:after="120" w:line="360" w:lineRule="auto"/>
+        <w:spacing w:before="360" w:after="120"/>
+      </w:pPr>
+      <w:r>
         <w:rPr>
-          <w:rFonts w:asciiTheme="minorHAnsi" w:hAnsiTheme="minorHAnsi"/>
-        </w:rPr>
-      </w:pPr>
-      <w:bookmarkStart w:id="44" w:name="_Toc237224181"/>
-      <w:r>
-        <w:rPr>
-          <w:rFonts w:asciiTheme="minorHAnsi" w:hAnsiTheme="minorHAnsi"/>
+          <w:b/>
           <w:color w:val="1A1A1A"/>
           <w:sz w:val="32"/>
         </w:rPr>
-        <w:t>Appendix A: Testing Summary</w:t>
-      </w:r>
-      <w:bookmarkEnd w:id="44"/>
-    </w:p>
-    <w:p>
-      <w:pPr>
-        <w:spacing w:after="160" w:line="360" w:lineRule="auto"/>
-      </w:pPr>
-      <w:r>
-        <w:t>Correctness was established at three levels: unit tests over the algorithmic components, benchmark-driven validation of whole-system behaviour against the paper's predictions, and integrity checks in the analysis pipeline.</w:t>
-      </w:r>
-    </w:p>
-    <w:p>
-      <w:pPr>
-        <w:spacing w:after="160" w:line="360" w:lineRule="auto"/>
-      </w:pPr>
-      <w:r>
-        <w:t>Each level targets specific requirements from Chapter 3. FR1-FR3 (the WST and the two algorithms) have the most precise published specification and receive direct unit tests. FR4-FR6 (the event loop, the baselines and the workload generator) are behavioural, and are verified through the whole-</w:t>
-      </w:r>
-      <w:r>
-        <w:lastRenderedPageBreak/>
-        <w:t>system predicates, which would fail if any of them misbehaved. FR7 (metrics recording) is verified by the pipeline's data-integrity checks, and NFR1 (lock-free concurrency) by the ring-buffer tests.</w:t>
-      </w:r>
-    </w:p>
-    <w:p>
-      <w:pPr>
-        <w:spacing w:after="160" w:line="360" w:lineRule="auto"/>
-      </w:pPr>
-      <w:r>
-        <w:t>The 17 unit tests (run with cargo test) cover: the scheduler's three filters, including hang detection and readmission, cold-start permissiveness, average-plus-theta pruning and theta's floor; the dispatcher's reciprocal_scale (matching the kernel's implementation exactly), Nth-set-bit selection and fallback rule; the simulation's epoll-exclusive model (the eBPF version needs no equivalent, since the kernel provides the mechanism); and the shared-memory ring's ordering, overflow rejection and index wrap-around. The scheduler's tests carry over to the eBPF version unmodified, because the scheduler itself does, confirming the design boundary described in Section 6.1.</w:t>
-      </w:r>
-    </w:p>
-    <w:p>
-      <w:pPr>
-        <w:spacing w:after="160" w:line="360" w:lineRule="auto"/>
-      </w:pPr>
-      <w:r>
-        <w:t>Whole-system validation is benchmark driven. The paper's qualitative expectations were written down as eight machine-checkable predicates before the benchmarks were run (for example: "Case 3: LIFO's open-connection SD exceeds three times either alternative's"), and the analysis notebook evaluates them against every run. Data integrity is asserted at load time: every policy × case × load × trial combination must be present, with no negative latencies.</w:t>
-      </w:r>
-    </w:p>
-    <w:p>
-      <w:pPr>
-        <w:spacing w:after="160" w:line="360" w:lineRule="auto"/>
-      </w:pPr>
-      <w:r>
-        <w:t>All eight predicates hold for the simulation. For the eBPF version, seven hold and one fails: Micro-Hermes's Case 4 tail-latency advantage over reuseport is 1.40x where the predicate, calibrated in advance against the simulation's numbers, required 1.5x. The direction of the result is unchanged and the margin still widens with load; the threshold is reported as failing rather than quietly re-tuned.</w:t>
-      </w:r>
-    </w:p>
-    <w:p>
-      <w:pPr>
-        <w:spacing w:after="160" w:line="360" w:lineRule="auto"/>
-      </w:pPr>
-      <w:r>
-        <w:t>Debugging relied on the VERBOSE per-iteration trace and the per-run console summary, whose per-worker counts must reconcile with the generator's totals; both artefacts recorded in Section 7.5 were found through these traces. The eBPF version's per-run script additionally fails loudly if the load balancer exits before it is listening, rather than silently producing an empty result file.</w:t>
-      </w:r>
-    </w:p>
-    <w:p>
-      <w:pPr>
-        <w:pStyle w:val="Heading1"/>
-        <w:spacing w:before="360" w:after="120" w:line="360" w:lineRule="auto"/>
-        <w:rPr>
-          <w:rFonts w:asciiTheme="minorHAnsi" w:hAnsiTheme="minorHAnsi"/>
-        </w:rPr>
-      </w:pPr>
-      <w:bookmarkStart w:id="45" w:name="_Toc237224182"/>
-      <w:r>
-        <w:rPr>
-          <w:rFonts w:asciiTheme="minorHAnsi" w:hAnsiTheme="minorHAnsi"/>
-          <w:color w:val="1A1A1A"/>
-          <w:sz w:val="32"/>
-        </w:rPr>
-        <w:t>Appendix B: User Manual</w:t>
-      </w:r>
-      <w:bookmarkEnd w:id="45"/>
-    </w:p>
-    <w:p>
-      <w:pPr>
-        <w:spacing w:after="160" w:line="360" w:lineRule="auto"/>
-      </w:pPr>
-      <w:r>
-        <w:t>The two versions are built and run separately: the simulation runs on any Unix-like system, while the eBPF version requires Linux, because it loads a program into the kernel.</w:t>
-      </w:r>
-    </w:p>
-    <w:p>
-      <w:pPr>
-        <w:spacing w:after="160" w:line="360" w:lineRule="auto"/>
-      </w:pPr>
-      <w:r>
-        <w:t>Part 1: The Simulation</w:t>
-      </w:r>
-    </w:p>
-    <w:p>
-      <w:pPr>
-        <w:spacing w:after="160" w:line="360" w:lineRule="auto"/>
-      </w:pPr>
-      <w:r>
-        <w:t>Requirements. A stable Rust toolchain; the analysis pipeline additionally needs Python 3 with pandas, numpy, matplotlib and Jupyter.</w:t>
-      </w:r>
-    </w:p>
-    <w:p>
-      <w:pPr>
-        <w:spacing w:after="160" w:line="360" w:lineRule="auto"/>
-      </w:pPr>
-      <w:r>
-        <w:lastRenderedPageBreak/>
-        <w:t>Building and running a single simulation, from the phase1/ directory:</w:t>
-      </w:r>
-    </w:p>
-    <w:p>
-      <w:pPr>
-        <w:spacing w:before="120" w:after="120" w:line="360" w:lineRule="auto"/>
-      </w:pPr>
-      <w:r>
-        <w:rPr>
-          <w:rFonts w:ascii="Courier New" w:hAnsi="Courier New"/>
-          <w:sz w:val="20"/>
-        </w:rPr>
-        <w:t xml:space="preserve">    cargo run --release</w:t>
-      </w:r>
-    </w:p>
-    <w:p>
-      <w:pPr>
-        <w:spacing w:after="160" w:line="360" w:lineRule="auto"/>
-      </w:pPr>
-      <w:r>
-        <w:t>Configuration is via environment variables:</w:t>
-      </w:r>
-    </w:p>
-    <w:p>
-      <w:pPr>
-        <w:spacing w:before="120" w:after="120" w:line="360" w:lineRule="auto"/>
-      </w:pPr>
-      <w:r>
-        <w:rPr>
-          <w:rFonts w:ascii="Courier New" w:hAnsi="Courier New"/>
-          <w:sz w:val="20"/>
-        </w:rPr>
-        <w:t xml:space="preserve">    POLICY         </w:t>
-      </w:r>
-      <w:proofErr w:type="spellStart"/>
-      <w:r>
-        <w:rPr>
-          <w:rFonts w:ascii="Courier New" w:hAnsi="Courier New"/>
-          <w:sz w:val="20"/>
-        </w:rPr>
-        <w:t>hermes</w:t>
-      </w:r>
-      <w:proofErr w:type="spellEnd"/>
-      <w:r>
-        <w:rPr>
-          <w:rFonts w:ascii="Courier New" w:hAnsi="Courier New"/>
-          <w:sz w:val="20"/>
-        </w:rPr>
-        <w:t xml:space="preserve"> | </w:t>
-      </w:r>
-      <w:proofErr w:type="spellStart"/>
-      <w:r>
-        <w:rPr>
-          <w:rFonts w:ascii="Courier New" w:hAnsi="Courier New"/>
-          <w:sz w:val="20"/>
-        </w:rPr>
-        <w:t>lifo</w:t>
-      </w:r>
-      <w:proofErr w:type="spellEnd"/>
-      <w:r>
-        <w:rPr>
-          <w:rFonts w:ascii="Courier New" w:hAnsi="Courier New"/>
-          <w:sz w:val="20"/>
-        </w:rPr>
-        <w:t xml:space="preserve"> | reuseport      (default: </w:t>
-      </w:r>
-      <w:proofErr w:type="spellStart"/>
-      <w:r>
-        <w:rPr>
-          <w:rFonts w:ascii="Courier New" w:hAnsi="Courier New"/>
-          <w:sz w:val="20"/>
-        </w:rPr>
-        <w:t>hermes</w:t>
-      </w:r>
-      <w:proofErr w:type="spellEnd"/>
-      <w:r>
-        <w:rPr>
-          <w:rFonts w:ascii="Courier New" w:hAnsi="Courier New"/>
-          <w:sz w:val="20"/>
-        </w:rPr>
-        <w:t>)</w:t>
-      </w:r>
-      <w:r>
-        <w:br/>
-      </w:r>
-      <w:r>
-        <w:rPr>
-          <w:rFonts w:ascii="Courier New" w:hAnsi="Courier New"/>
-          <w:sz w:val="20"/>
-        </w:rPr>
-        <w:t xml:space="preserve">    WORKLOAD_CASE  1 | 2 | 3 | 4 | 5 | default    (default: default)</w:t>
-      </w:r>
-      <w:r>
-        <w:br/>
-      </w:r>
-      <w:r>
-        <w:rPr>
-          <w:rFonts w:ascii="Courier New" w:hAnsi="Courier New"/>
-          <w:sz w:val="20"/>
-        </w:rPr>
-        <w:t xml:space="preserve">    LOAD           light | medium | heavy         (default: the</w:t>
-      </w:r>
-      <w:r>
-        <w:br/>
-      </w:r>
-      <w:r>
-        <w:rPr>
-          <w:rFonts w:ascii="Courier New" w:hAnsi="Courier New"/>
-          <w:sz w:val="20"/>
-        </w:rPr>
-        <w:t xml:space="preserve">                   case's characteristic level)</w:t>
-      </w:r>
-      <w:r>
-        <w:br/>
-      </w:r>
-      <w:r>
-        <w:rPr>
-          <w:rFonts w:ascii="Courier New" w:hAnsi="Courier New"/>
-          <w:sz w:val="20"/>
-        </w:rPr>
-        <w:t xml:space="preserve">    SEED           integer; varies the connection stream between</w:t>
-      </w:r>
-      <w:r>
-        <w:br/>
-      </w:r>
-      <w:r>
-        <w:rPr>
-          <w:rFonts w:ascii="Courier New" w:hAnsi="Courier New"/>
-          <w:sz w:val="20"/>
-        </w:rPr>
-        <w:t xml:space="preserve">                   trials</w:t>
-      </w:r>
-      <w:r>
-        <w:rPr>
-          <w:rFonts w:ascii="Courier New" w:hAnsi="Courier New"/>
-          <w:sz w:val="20"/>
-        </w:rPr>
-        <w:tab/>
-      </w:r>
-      <w:r>
-        <w:rPr>
-          <w:rFonts w:ascii="Courier New" w:hAnsi="Courier New"/>
-          <w:sz w:val="20"/>
-        </w:rPr>
-        <w:t xml:space="preserve">              (default: 0)</w:t>
-      </w:r>
-      <w:r>
-        <w:br/>
-      </w:r>
-      <w:r>
-        <w:rPr>
-          <w:rFonts w:ascii="Courier New" w:hAnsi="Courier New"/>
-          <w:sz w:val="20"/>
-        </w:rPr>
-        <w:t xml:space="preserve">    METRICS_PATH   per-iteration tick CSV   (default: metrics.csv)</w:t>
-      </w:r>
-      <w:r>
-        <w:br/>
-      </w:r>
-      <w:r>
-        <w:rPr>
-          <w:rFonts w:ascii="Courier New" w:hAnsi="Courier New"/>
-          <w:sz w:val="20"/>
-        </w:rPr>
-        <w:t xml:space="preserve">    CONNS_PATH     per-connection CSV       (default: conns.csv)</w:t>
-      </w:r>
-      <w:r>
-        <w:br/>
-      </w:r>
-      <w:r>
-        <w:rPr>
-          <w:rFonts w:ascii="Courier New" w:hAnsi="Courier New"/>
-          <w:sz w:val="20"/>
-        </w:rPr>
-        <w:t xml:space="preserve">    VERBOSE        1 to print every worker loop iteration</w:t>
-      </w:r>
-    </w:p>
-    <w:p>
-      <w:pPr>
-        <w:spacing w:after="160" w:line="360" w:lineRule="auto"/>
-      </w:pPr>
-      <w:r>
-        <w:t>For example, the overloaded compression-heavy case under the Hermes policy:</w:t>
-      </w:r>
-    </w:p>
-    <w:p>
-      <w:pPr>
-        <w:spacing w:before="120" w:after="120" w:line="360" w:lineRule="auto"/>
-      </w:pPr>
-      <w:r>
-        <w:rPr>
-          <w:rFonts w:ascii="Courier New" w:hAnsi="Courier New"/>
-          <w:sz w:val="20"/>
-        </w:rPr>
-        <w:t xml:space="preserve">    POLICY=hermes WORKLOAD_CASE=2 LOAD=heavy cargo run --release</w:t>
-      </w:r>
-    </w:p>
-    <w:p>
-      <w:pPr>
-        <w:spacing w:after="160" w:line="360" w:lineRule="auto"/>
-      </w:pPr>
-      <w:r>
-        <w:t>Each run prints a summary and writes the two CSVs. Unit tests run with `cargo test`.</w:t>
-      </w:r>
-    </w:p>
-    <w:p>
-      <w:pPr>
-        <w:spacing w:after="160" w:line="360" w:lineRule="auto"/>
-      </w:pPr>
-      <w:r>
-        <w:t>The full benchmark matrix (3 policies × {4 cases × 3 load levels + Case 5} × 3 trials, 8 minutes) is driven by `analysis/run_benchmarks.sh`, which writes per-run CSVs into `analysis/results/`, skipping existing files so an interrupted run can be resumed.</w:t>
-      </w:r>
-    </w:p>
-    <w:p>
-      <w:pPr>
-        <w:spacing w:after="160" w:line="360" w:lineRule="auto"/>
-      </w:pPr>
-      <w:r>
-        <w:t>Part 2: The eBPF Version</w:t>
-      </w:r>
-    </w:p>
-    <w:p>
-      <w:pPr>
-        <w:spacing w:after="160" w:line="360" w:lineRule="auto"/>
-      </w:pPr>
-      <w:r>
-        <w:t xml:space="preserve">Requirements. Linux (developed </w:t>
-      </w:r>
-      <w:r>
-        <w:t>on current</w:t>
-      </w:r>
-      <w:r>
-        <w:t xml:space="preserve"> Ubuntu). Beyond the Rust toolchain, compiling the kernel program needs the nightly toolchain with `rust-src` and the `bpf-linker` tool:</w:t>
-      </w:r>
-    </w:p>
-    <w:p>
-      <w:pPr>
-        <w:spacing w:before="120" w:after="120" w:line="360" w:lineRule="auto"/>
-      </w:pPr>
-      <w:r>
-        <w:rPr>
-          <w:rFonts w:ascii="Courier New" w:hAnsi="Courier New"/>
-          <w:sz w:val="20"/>
-        </w:rPr>
-        <w:t xml:space="preserve">    rustup toolchain install nightly --component rust-src</w:t>
-      </w:r>
-      <w:r>
-        <w:br/>
-      </w:r>
-      <w:r>
-        <w:rPr>
-          <w:rFonts w:ascii="Courier New" w:hAnsi="Courier New"/>
-          <w:sz w:val="20"/>
-        </w:rPr>
-        <w:t xml:space="preserve">    cargo install cargo-binstall &amp;&amp; cargo binstall bpf-linker</w:t>
-      </w:r>
-    </w:p>
-    <w:p>
-      <w:pPr>
-        <w:spacing w:after="160" w:line="360" w:lineRule="auto"/>
-      </w:pPr>
-      <w:r>
-        <w:t>Loading a program into the kernel requires administrator privileges, so the benchmark scripts start the load balancer under `sudo` for every policy.</w:t>
-      </w:r>
-    </w:p>
-    <w:p>
-      <w:pPr>
-        <w:spacing w:after="160" w:line="360" w:lineRule="auto"/>
-      </w:pPr>
-      <w:r>
-        <w:t>Building both binaries</w:t>
-      </w:r>
-      <w:r>
-        <w:t xml:space="preserve"> </w:t>
-      </w:r>
-      <w:r>
-        <w:t>from the repository root:</w:t>
-      </w:r>
-    </w:p>
-    <w:p>
-      <w:pPr>
-        <w:spacing w:before="120" w:after="120" w:line="360" w:lineRule="auto"/>
-      </w:pPr>
-      <w:r>
-        <w:rPr>
-          <w:rFonts w:ascii="Courier New" w:hAnsi="Courier New"/>
-          <w:sz w:val="20"/>
-        </w:rPr>
-        <w:t xml:space="preserve">    cargo build --release -p hermes -p hermes-bench</w:t>
-      </w:r>
-    </w:p>
-    <w:p>
-      <w:pPr>
-        <w:spacing w:after="160" w:line="360" w:lineRule="auto"/>
-      </w:pPr>
-      <w:r>
-        <w:t>Running one benchmark point end to end (starts the load balancer, runs the load generator against it, shuts it down):</w:t>
-      </w:r>
-    </w:p>
-    <w:p>
-      <w:pPr>
-        <w:spacing w:before="120" w:after="120" w:line="360" w:lineRule="auto"/>
-      </w:pPr>
-      <w:r>
-        <w:rPr>
-          <w:rFonts w:ascii="Courier New" w:hAnsi="Courier New"/>
-          <w:sz w:val="20"/>
-        </w:rPr>
-        <w:lastRenderedPageBreak/>
-        <w:t xml:space="preserve">    benchmark/run_case.sh &lt;policy&gt; &lt;case&gt; &lt;load&gt; &lt;trial&gt;</w:t>
-      </w:r>
-    </w:p>
-    <w:p>
-      <w:pPr>
-        <w:spacing w:after="160" w:line="360" w:lineRule="auto"/>
-      </w:pPr>
-      <w:r>
-        <w:t>The full matrix, matching the simulation's:</w:t>
-      </w:r>
-    </w:p>
-    <w:p>
-      <w:pPr>
-        <w:spacing w:before="120" w:after="120" w:line="360" w:lineRule="auto"/>
-      </w:pPr>
-      <w:r>
-        <w:rPr>
-          <w:rFonts w:ascii="Courier New" w:hAnsi="Courier New"/>
-          <w:sz w:val="20"/>
-        </w:rPr>
-        <w:t xml:space="preserve">    benchmark/run_all.sh          # 3 trials</w:t>
-      </w:r>
-      <w:r>
-        <w:br/>
-      </w:r>
-      <w:r>
-        <w:rPr>
-          <w:rFonts w:ascii="Courier New" w:hAnsi="Courier New"/>
-          <w:sz w:val="20"/>
-        </w:rPr>
-        <w:t xml:space="preserve">    TRIALS=5 benchmark/run_all.sh # more trials for tighter error bars</w:t>
-      </w:r>
-    </w:p>
-    <w:p>
-      <w:pPr>
-        <w:spacing w:after="160" w:line="360" w:lineRule="auto"/>
-      </w:pPr>
-      <w:r>
-        <w:t>Results are written to `benchmark/results/`: per-connection records from the load generator plus per-iteration records from each worker.</w:t>
-      </w:r>
-    </w:p>
-    <w:p>
-      <w:pPr>
-        <w:spacing w:after="160" w:line="360" w:lineRule="auto"/>
-      </w:pPr>
-      <w:r>
-        <w:t>Part 3: Regenerating Figures and Tables</w:t>
-      </w:r>
-    </w:p>
-    <w:p>
-      <w:pPr>
-        <w:spacing w:before="120" w:after="120" w:line="360" w:lineRule="auto"/>
-      </w:pPr>
-      <w:r>
-        <w:rPr>
-          <w:rFonts w:ascii="Courier New" w:hAnsi="Courier New"/>
-          <w:sz w:val="20"/>
-        </w:rPr>
-        <w:t xml:space="preserve">    cd analysis &amp;&amp; jupyter lab hermes_analysis.ipynb</w:t>
-      </w:r>
-      <w:r>
-        <w:br/>
-      </w:r>
-      <w:r>
-        <w:rPr>
-          <w:rFonts w:ascii="Courier New" w:hAnsi="Courier New"/>
-          <w:sz w:val="20"/>
-        </w:rPr>
-        <w:t xml:space="preserve">    # then: Kernel → Restart &amp; Run All</w:t>
-      </w:r>
-    </w:p>
-    <w:p>
-      <w:pPr>
-        <w:spacing w:after="160" w:line="360" w:lineRule="auto"/>
-      </w:pPr>
-      <w:r>
-        <w:t>The notebook regenerates all figures (`analysis/figures/`) and tables (`analysis/tables/`) from whichever results directory its `RESULTS_DIR` points at: `analysis/results/` for the simulation, `benchmark/results/` for the eBPF version. The output paths are shared, so regenerating one version's artefacts overwrites the other's unless the output is redirected.</w:t>
-      </w:r>
-    </w:p>
-    <w:p>
-      <w:pPr>
-        <w:pStyle w:val="Heading1"/>
-        <w:spacing w:before="360" w:after="120" w:line="360" w:lineRule="auto"/>
-        <w:rPr>
-          <w:rFonts w:asciiTheme="minorHAnsi" w:hAnsiTheme="minorHAnsi"/>
-        </w:rPr>
-      </w:pPr>
-      <w:bookmarkStart w:id="46" w:name="_Toc237224183"/>
-      <w:r>
-        <w:rPr>
-          <w:rFonts w:asciiTheme="minorHAnsi" w:hAnsiTheme="minorHAnsi"/>
-          <w:color w:val="1A1A1A"/>
-          <w:sz w:val="32"/>
-        </w:rPr>
-        <w:t>Appendix C: Ethics Self-Assessment</w:t>
-      </w:r>
-      <w:bookmarkEnd w:id="46"/>
+        <w:t>Appendix A: Ethics Self-Assessment</w:t>
+      </w:r>
     </w:p>
     <w:p>
       <w:pPr>

</xml_diff>